<commit_message>
Refresh: docs && new override war class
</commit_message>
<xml_diff>
--- a/programming/lab3/docs/report.docx
+++ b/programming/lab3/docs/report.docx
@@ -81,7 +81,6 @@
         <w:jc w:val="center"/>
         <w:rPr>
           <w:rFonts w:ascii="Times New Roman" w:hAnsi="Times New Roman" w:cs="Times New Roman"/>
-          <w:lang w:val="en-US"/>
         </w:rPr>
       </w:pPr>
       <w:r>
@@ -93,7 +92,6 @@
       <w:r>
         <w:rPr>
           <w:rFonts w:ascii="Times New Roman" w:hAnsi="Times New Roman" w:cs="Times New Roman"/>
-          <w:lang w:val="en-US"/>
         </w:rPr>
         <w:t>3</w:t>
       </w:r>
@@ -103,7 +101,6 @@
         <w:jc w:val="center"/>
         <w:rPr>
           <w:rFonts w:ascii="Times New Roman" w:hAnsi="Times New Roman" w:cs="Times New Roman"/>
-          <w:lang w:val="en-US"/>
         </w:rPr>
       </w:pPr>
       <w:r>
@@ -121,7 +118,6 @@
       <w:r>
         <w:rPr>
           <w:rFonts w:ascii="Times New Roman" w:hAnsi="Times New Roman" w:cs="Times New Roman"/>
-          <w:lang w:val="en-US"/>
         </w:rPr>
         <w:t>52</w:t>
       </w:r>
@@ -2406,7 +2402,6 @@
       <w:pPr>
         <w:rPr>
           <w:rFonts w:ascii="Times New Roman" w:hAnsi="Times New Roman" w:cs="Times New Roman"/>
-          <w:lang w:val="en-US"/>
         </w:rPr>
       </w:pPr>
       <w:r>
@@ -2612,6 +2607,7 @@
         </w:rPr>
         <w:t>(</w:t>
       </w:r>
+      <w:proofErr w:type="spellStart"/>
       <w:r>
         <w:rPr>
           <w:rFonts w:ascii="Times New Roman" w:hAnsi="Times New Roman" w:cs="Times New Roman"/>
@@ -2619,6 +2615,7 @@
         </w:rPr>
         <w:t>giveEscape</w:t>
       </w:r>
+      <w:proofErr w:type="spellEnd"/>
       <w:r>
         <w:rPr>
           <w:rFonts w:ascii="Times New Roman" w:hAnsi="Times New Roman" w:cs="Times New Roman"/>
@@ -2701,12 +2698,14 @@
         </w:rPr>
         <w:t xml:space="preserve"> (</w:t>
       </w:r>
+      <w:proofErr w:type="spellStart"/>
       <w:r>
         <w:rPr>
           <w:rFonts w:ascii="Times New Roman" w:hAnsi="Times New Roman" w:cs="Times New Roman"/>
         </w:rPr>
         <w:t>escape</w:t>
       </w:r>
+      <w:proofErr w:type="spellEnd"/>
       <w:r>
         <w:rPr>
           <w:rFonts w:ascii="Times New Roman" w:hAnsi="Times New Roman" w:cs="Times New Roman"/>
@@ -2737,12 +2736,14 @@
         </w:rPr>
         <w:t xml:space="preserve"> (</w:t>
       </w:r>
+      <w:proofErr w:type="spellStart"/>
       <w:r>
         <w:rPr>
           <w:rFonts w:ascii="Times New Roman" w:hAnsi="Times New Roman" w:cs="Times New Roman"/>
         </w:rPr>
         <w:t>serveDish</w:t>
       </w:r>
+      <w:proofErr w:type="spellEnd"/>
       <w:r>
         <w:rPr>
           <w:rFonts w:ascii="Times New Roman" w:hAnsi="Times New Roman" w:cs="Times New Roman"/>
@@ -2788,6 +2789,7 @@
         </w:rPr>
         <w:t xml:space="preserve">, а также методы </w:t>
       </w:r>
+      <w:proofErr w:type="spellStart"/>
       <w:r>
         <w:rPr>
           <w:rFonts w:ascii="Times New Roman" w:hAnsi="Times New Roman" w:cs="Times New Roman"/>
@@ -2795,6 +2797,7 @@
         </w:rPr>
         <w:t>hashCode</w:t>
       </w:r>
+      <w:proofErr w:type="spellEnd"/>
       <w:r>
         <w:rPr>
           <w:rFonts w:ascii="Times New Roman" w:hAnsi="Times New Roman" w:cs="Times New Roman"/>
@@ -2814,6 +2817,7 @@
         </w:rPr>
         <w:t xml:space="preserve">(), </w:t>
       </w:r>
+      <w:proofErr w:type="spellStart"/>
       <w:r>
         <w:rPr>
           <w:rFonts w:ascii="Times New Roman" w:hAnsi="Times New Roman" w:cs="Times New Roman"/>
@@ -2821,6 +2825,7 @@
         </w:rPr>
         <w:t>toString</w:t>
       </w:r>
+      <w:proofErr w:type="spellEnd"/>
       <w:r>
         <w:rPr>
           <w:rFonts w:ascii="Times New Roman" w:hAnsi="Times New Roman" w:cs="Times New Roman"/>
@@ -2885,7 +2890,6 @@
       <w:pPr>
         <w:rPr>
           <w:rFonts w:ascii="Times New Roman" w:hAnsi="Times New Roman" w:cs="Times New Roman"/>
-          <w:lang w:val="en-US"/>
         </w:rPr>
       </w:pPr>
       <w:r>
@@ -2977,59 +2981,48 @@
       <w:pPr>
         <w:rPr>
           <w:rFonts w:ascii="Times New Roman" w:hAnsi="Times New Roman" w:cs="Times New Roman"/>
+        </w:rPr>
+      </w:pPr>
+      <w:r>
+        <w:rPr>
+          <w:rFonts w:ascii="Times New Roman" w:hAnsi="Times New Roman" w:cs="Times New Roman"/>
+        </w:rPr>
+        <w:t>Блюдо (</w:t>
+      </w:r>
+      <w:r>
+        <w:rPr>
+          <w:rFonts w:ascii="Times New Roman" w:hAnsi="Times New Roman" w:cs="Times New Roman"/>
           <w:lang w:val="en-US"/>
         </w:rPr>
-      </w:pPr>
-      <w:r>
-        <w:rPr>
-          <w:rFonts w:ascii="Times New Roman" w:hAnsi="Times New Roman" w:cs="Times New Roman"/>
-        </w:rPr>
-        <w:t>Блюдо (</w:t>
-      </w:r>
+        <w:t>Cook</w:t>
+      </w:r>
+      <w:r>
+        <w:rPr>
+          <w:rFonts w:ascii="Times New Roman" w:hAnsi="Times New Roman" w:cs="Times New Roman"/>
+        </w:rPr>
+        <w:t xml:space="preserve">) – объект, который используется для готовки еды, так Паштет-сюзерен является одним из </w:t>
+      </w:r>
+      <w:r>
+        <w:rPr>
+          <w:rFonts w:ascii="Times New Roman" w:hAnsi="Times New Roman" w:cs="Times New Roman"/>
+        </w:rPr>
+        <w:t>блюд</w:t>
+      </w:r>
+      <w:r>
+        <w:rPr>
+          <w:rFonts w:ascii="Times New Roman" w:hAnsi="Times New Roman" w:cs="Times New Roman"/>
+        </w:rPr>
+        <w:t xml:space="preserve">, будет </w:t>
+      </w:r>
+      <w:proofErr w:type="spellStart"/>
       <w:r>
         <w:rPr>
           <w:rFonts w:ascii="Times New Roman" w:hAnsi="Times New Roman" w:cs="Times New Roman"/>
           <w:lang w:val="en-US"/>
         </w:rPr>
-        <w:t>Cook</w:t>
-      </w:r>
-      <w:r>
-        <w:rPr>
-          <w:rFonts w:ascii="Times New Roman" w:hAnsi="Times New Roman" w:cs="Times New Roman"/>
-        </w:rPr>
-        <w:t xml:space="preserve">) – объект, который используется для готовки еды, так </w:t>
-      </w:r>
-      <w:r>
-        <w:rPr>
-          <w:rFonts w:ascii="Times New Roman" w:hAnsi="Times New Roman" w:cs="Times New Roman"/>
-        </w:rPr>
-        <w:t xml:space="preserve">Паштет-сюзерен </w:t>
-      </w:r>
-      <w:r>
-        <w:rPr>
-          <w:rFonts w:ascii="Times New Roman" w:hAnsi="Times New Roman" w:cs="Times New Roman"/>
-        </w:rPr>
-        <w:t xml:space="preserve">является одним из </w:t>
-      </w:r>
-      <w:r>
-        <w:rPr>
-          <w:rFonts w:ascii="Times New Roman" w:hAnsi="Times New Roman" w:cs="Times New Roman"/>
-        </w:rPr>
-        <w:t>блюд</w:t>
-      </w:r>
-      <w:r>
-        <w:rPr>
-          <w:rFonts w:ascii="Times New Roman" w:hAnsi="Times New Roman" w:cs="Times New Roman"/>
-        </w:rPr>
-        <w:t xml:space="preserve">, будет </w:t>
-      </w:r>
-      <w:r>
-        <w:rPr>
-          <w:rFonts w:ascii="Times New Roman" w:hAnsi="Times New Roman" w:cs="Times New Roman"/>
-          <w:lang w:val="en-US"/>
-        </w:rPr>
         <w:t>enum</w:t>
       </w:r>
+      <w:proofErr w:type="spellEnd"/>
       <w:r>
         <w:rPr>
           <w:rFonts w:ascii="Times New Roman" w:hAnsi="Times New Roman" w:cs="Times New Roman"/>
@@ -3119,6 +3112,7 @@
         </w:rPr>
         <w:t xml:space="preserve">сли не дали возможность сбежать повару, то он не может сбежать и выкидываем проверяемую ошибку </w:t>
       </w:r>
+      <w:proofErr w:type="spellStart"/>
       <w:r>
         <w:rPr>
           <w:rFonts w:ascii="Times New Roman" w:hAnsi="Times New Roman" w:cs="Times New Roman"/>
@@ -3126,6 +3120,7 @@
         </w:rPr>
         <w:t>CantEscape</w:t>
       </w:r>
+      <w:proofErr w:type="spellEnd"/>
     </w:p>
     <w:p>
       <w:pPr>
@@ -3165,6 +3160,7 @@
         </w:rPr>
         <w:t xml:space="preserve"> реакции добавим метод </w:t>
       </w:r>
+      <w:proofErr w:type="spellStart"/>
       <w:r>
         <w:rPr>
           <w:rFonts w:ascii="Times New Roman" w:hAnsi="Times New Roman" w:cs="Times New Roman"/>
@@ -3172,6 +3168,7 @@
         </w:rPr>
         <w:t>reactTo</w:t>
       </w:r>
+      <w:proofErr w:type="spellEnd"/>
       <w:r>
         <w:rPr>
           <w:rFonts w:ascii="Times New Roman" w:hAnsi="Times New Roman" w:cs="Times New Roman"/>
@@ -3215,7 +3212,6 @@
       <w:pPr>
         <w:rPr>
           <w:rFonts w:ascii="Times New Roman" w:hAnsi="Times New Roman" w:cs="Times New Roman"/>
-          <w:lang w:val="en-US"/>
         </w:rPr>
       </w:pPr>
       <w:r>
@@ -3440,7 +3436,21 @@
         <w:rPr>
           <w:rFonts w:ascii="Times New Roman" w:hAnsi="Times New Roman" w:cs="Times New Roman"/>
         </w:rPr>
-        <w:t>сли Герцог не разрешил, выбрасывается проверяемое исключение CantEscape, программа ловит его, выводит сообщение об ошибке, и войны не будет</w:t>
+        <w:t xml:space="preserve">сли Герцог не разрешил, выбрасывается проверяемое исключение </w:t>
+      </w:r>
+      <w:proofErr w:type="spellStart"/>
+      <w:r>
+        <w:rPr>
+          <w:rFonts w:ascii="Times New Roman" w:hAnsi="Times New Roman" w:cs="Times New Roman"/>
+        </w:rPr>
+        <w:t>CantEscape</w:t>
+      </w:r>
+      <w:proofErr w:type="spellEnd"/>
+      <w:r>
+        <w:rPr>
+          <w:rFonts w:ascii="Times New Roman" w:hAnsi="Times New Roman" w:cs="Times New Roman"/>
+        </w:rPr>
+        <w:t>, программа ловит его, выводит сообщение об ошибке, и войны не будет</w:t>
       </w:r>
     </w:p>
     <w:p>
@@ -3540,7 +3550,20 @@
         <w:rPr>
           <w:rFonts w:ascii="Times New Roman" w:hAnsi="Times New Roman" w:cs="Times New Roman"/>
         </w:rPr>
-        <w:t>Создается объект War, статус которого устанавливается в WarStatus.WAR. Война добавляется в списки активных войн обоих лидеров</w:t>
+        <w:t>Создается объект War, статус которого устанавливается в</w:t>
+      </w:r>
+      <w:r>
+        <w:rPr>
+          <w:rFonts w:ascii="Times New Roman" w:hAnsi="Times New Roman" w:cs="Times New Roman"/>
+          <w:lang w:val="en-US"/>
+        </w:rPr>
+        <w:t xml:space="preserve"> </w:t>
+      </w:r>
+      <w:r>
+        <w:rPr>
+          <w:rFonts w:ascii="Times New Roman" w:hAnsi="Times New Roman" w:cs="Times New Roman"/>
+        </w:rPr>
+        <w:t>WAR. Война добавляется в списки активных войн обоих лидеров</w:t>
       </w:r>
     </w:p>
     <w:p>
@@ -3612,8 +3635,30 @@
         <w:rPr>
           <w:rFonts w:ascii="Times New Roman" w:hAnsi="Times New Roman" w:cs="Times New Roman"/>
         </w:rPr>
-        <w:t>Если терпение одного из них падает до 0, сражения останавливаются. Создается объект record Contract</w:t>
-      </w:r>
+        <w:t xml:space="preserve">Если терпение одного из них падает до 0, сражения останавливаются. Создается объект </w:t>
+      </w:r>
+      <w:proofErr w:type="spellStart"/>
+      <w:r>
+        <w:rPr>
+          <w:rFonts w:ascii="Times New Roman" w:hAnsi="Times New Roman" w:cs="Times New Roman"/>
+        </w:rPr>
+        <w:t>record</w:t>
+      </w:r>
+      <w:proofErr w:type="spellEnd"/>
+      <w:r>
+        <w:rPr>
+          <w:rFonts w:ascii="Times New Roman" w:hAnsi="Times New Roman" w:cs="Times New Roman"/>
+        </w:rPr>
+        <w:t xml:space="preserve"> </w:t>
+      </w:r>
+      <w:proofErr w:type="spellStart"/>
+      <w:r>
+        <w:rPr>
+          <w:rFonts w:ascii="Times New Roman" w:hAnsi="Times New Roman" w:cs="Times New Roman"/>
+        </w:rPr>
+        <w:t>Contract</w:t>
+      </w:r>
+      <w:proofErr w:type="spellEnd"/>
       <w:r>
         <w:rPr>
           <w:rFonts w:ascii="Times New Roman" w:hAnsi="Times New Roman" w:cs="Times New Roman"/>
@@ -3624,7 +3669,19 @@
         <w:rPr>
           <w:rFonts w:ascii="Times New Roman" w:hAnsi="Times New Roman" w:cs="Times New Roman"/>
         </w:rPr>
-        <w:t>татус войны меняется на WarStatus.END, а война удаляется из списков активных.</w:t>
+        <w:t>татус войны меняется на</w:t>
+      </w:r>
+      <w:r>
+        <w:rPr>
+          <w:rFonts w:ascii="Times New Roman" w:hAnsi="Times New Roman" w:cs="Times New Roman"/>
+        </w:rPr>
+        <w:t xml:space="preserve"> </w:t>
+      </w:r>
+      <w:r>
+        <w:rPr>
+          <w:rFonts w:ascii="Times New Roman" w:hAnsi="Times New Roman" w:cs="Times New Roman"/>
+        </w:rPr>
+        <w:t>END, а война удаляется из списков активных.</w:t>
       </w:r>
     </w:p>
     <w:p>
@@ -3659,7 +3716,21 @@
         <w:rPr>
           <w:rFonts w:ascii="Times New Roman" w:hAnsi="Times New Roman" w:cs="Times New Roman"/>
         </w:rPr>
-        <w:t xml:space="preserve">Если после окончания войны будет предпринята попытка провести еще одно сражение, программа выбросит и поймает непроверяемое исключение WarEnded </w:t>
+        <w:t xml:space="preserve">Если после окончания войны будет предпринята попытка провести еще одно сражение, программа выбросит и поймает непроверяемое исключение </w:t>
+      </w:r>
+      <w:proofErr w:type="spellStart"/>
+      <w:r>
+        <w:rPr>
+          <w:rFonts w:ascii="Times New Roman" w:hAnsi="Times New Roman" w:cs="Times New Roman"/>
+        </w:rPr>
+        <w:t>WarEnded</w:t>
+      </w:r>
+      <w:proofErr w:type="spellEnd"/>
+      <w:r>
+        <w:rPr>
+          <w:rFonts w:ascii="Times New Roman" w:hAnsi="Times New Roman" w:cs="Times New Roman"/>
+        </w:rPr>
+        <w:t xml:space="preserve"> </w:t>
       </w:r>
     </w:p>
     <w:p>
@@ -3717,7 +3788,21 @@
         <w:rPr>
           <w:rFonts w:ascii="Times New Roman" w:hAnsi="Times New Roman" w:cs="Times New Roman"/>
         </w:rPr>
-        <w:t xml:space="preserve">Создается анонимный класс Person (Иностранный гость), который удивляется чести, оказанной </w:t>
+        <w:t xml:space="preserve">Создается анонимный класс </w:t>
+      </w:r>
+      <w:proofErr w:type="spellStart"/>
+      <w:r>
+        <w:rPr>
+          <w:rFonts w:ascii="Times New Roman" w:hAnsi="Times New Roman" w:cs="Times New Roman"/>
+        </w:rPr>
+        <w:t>Person</w:t>
+      </w:r>
+      <w:proofErr w:type="spellEnd"/>
+      <w:r>
+        <w:rPr>
+          <w:rFonts w:ascii="Times New Roman" w:hAnsi="Times New Roman" w:cs="Times New Roman"/>
+        </w:rPr>
+        <w:t xml:space="preserve"> (Иностранный гость), который удивляется чести, оказанной </w:t>
       </w:r>
       <w:r>
         <w:rPr>
@@ -3793,12 +3878,13 @@
       <w:r>
         <w:rPr>
           <w:rFonts w:ascii="Times New Roman" w:hAnsi="Times New Roman" w:cs="Times New Roman"/>
+          <w:noProof/>
         </w:rPr>
         <w:drawing>
-          <wp:inline distT="0" distB="0" distL="0" distR="0" wp14:anchorId="1D6145E1" wp14:editId="7142FEB8">
-            <wp:extent cx="5940425" cy="4303395"/>
-            <wp:effectExtent l="0" t="0" r="3175" b="1905"/>
-            <wp:docPr id="1154965681" name="Рисунок 1"/>
+          <wp:inline distT="0" distB="0" distL="0" distR="0" wp14:anchorId="0BAE4800" wp14:editId="4B0A5AF9">
+            <wp:extent cx="5940425" cy="4307840"/>
+            <wp:effectExtent l="0" t="0" r="3175" b="0"/>
+            <wp:docPr id="394827734" name="Рисунок 16"/>
             <wp:cNvGraphicFramePr>
               <a:graphicFrameLocks xmlns:a="http://schemas.openxmlformats.org/drawingml/2006/main" noChangeAspect="1"/>
             </wp:cNvGraphicFramePr>
@@ -3806,23 +3892,36 @@
               <a:graphicData uri="http://schemas.openxmlformats.org/drawingml/2006/picture">
                 <pic:pic xmlns:pic="http://schemas.openxmlformats.org/drawingml/2006/picture">
                   <pic:nvPicPr>
-                    <pic:cNvPr id="1154965681" name=""/>
-                    <pic:cNvPicPr/>
+                    <pic:cNvPr id="0" name="Picture 6"/>
+                    <pic:cNvPicPr>
+                      <a:picLocks noChangeAspect="1" noChangeArrowheads="1"/>
+                    </pic:cNvPicPr>
                   </pic:nvPicPr>
                   <pic:blipFill>
-                    <a:blip r:embed="rId10"/>
+                    <a:blip r:embed="rId10" cstate="print">
+                      <a:extLst>
+                        <a:ext uri="{28A0092B-C50C-407E-A947-70E740481C1C}">
+                          <a14:useLocalDpi xmlns:a14="http://schemas.microsoft.com/office/drawing/2010/main" val="0"/>
+                        </a:ext>
+                      </a:extLst>
+                    </a:blip>
+                    <a:srcRect/>
                     <a:stretch>
                       <a:fillRect/>
                     </a:stretch>
                   </pic:blipFill>
-                  <pic:spPr>
+                  <pic:spPr bwMode="auto">
                     <a:xfrm>
                       <a:off x="0" y="0"/>
-                      <a:ext cx="5940425" cy="4303395"/>
+                      <a:ext cx="5940425" cy="4307840"/>
                     </a:xfrm>
                     <a:prstGeom prst="rect">
                       <a:avLst/>
                     </a:prstGeom>
+                    <a:noFill/>
+                    <a:ln>
+                      <a:noFill/>
+                    </a:ln>
                   </pic:spPr>
                 </pic:pic>
               </a:graphicData>
@@ -3837,6 +3936,13 @@
           <w:rFonts w:ascii="Times New Roman" w:hAnsi="Times New Roman" w:cs="Times New Roman"/>
         </w:rPr>
       </w:pPr>
+    </w:p>
+    <w:p>
+      <w:pPr>
+        <w:rPr>
+          <w:rFonts w:ascii="Times New Roman" w:hAnsi="Times New Roman" w:cs="Times New Roman"/>
+        </w:rPr>
+      </w:pPr>
       <w:r>
         <w:rPr>
           <w:rFonts w:ascii="Times New Roman" w:hAnsi="Times New Roman" w:cs="Times New Roman"/>
@@ -3993,6 +4099,7 @@
         </w:rPr>
         <w:t>.</w:t>
       </w:r>
+      <w:proofErr w:type="spellStart"/>
       <w:r>
         <w:rPr>
           <w:rStyle w:val="ac"/>
@@ -4002,6 +4109,7 @@
         </w:rPr>
         <w:t>drawio</w:t>
       </w:r>
+      <w:proofErr w:type="spellEnd"/>
       <w:r>
         <w:rPr>
           <w:rStyle w:val="ac"/>
@@ -6102,6 +6210,7 @@
   <w:style w:type="character" w:default="1" w:styleId="a0">
     <w:name w:val="Default Paragraph Font"/>
     <w:uiPriority w:val="1"/>
+    <w:semiHidden/>
     <w:unhideWhenUsed/>
   </w:style>
   <w:style w:type="table" w:default="1" w:styleId="a1">

</xml_diff>